<commit_message>
Added relevent project parameter and updated scoring logic
</commit_message>
<xml_diff>
--- a/resumes/Vishv-Resume.docx
+++ b/resumes/Vishv-Resume.docx
@@ -302,7 +302,7 @@
           </mc:Choice>
           <mc:Fallback>
             <w:pict>
-              <v:group w14:anchorId="324ADB39" id="Group 2" o:spid="_x0000_s1026" style="position:absolute;margin-left:36.05pt;margin-top:19.7pt;width:540pt;height:4.2pt;z-index:-15728640;mso-wrap-distance-left:0;mso-wrap-distance-right:0;mso-position-horizontal-relative:page" coordsize="68580,533" o:gfxdata="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">
+              <v:group w14:anchorId="5C2C3D2E" id="Group 2" o:spid="_x0000_s1026" style="position:absolute;margin-left:36.05pt;margin-top:19.7pt;width:540pt;height:4.2pt;z-index:-15728640;mso-wrap-distance-left:0;mso-wrap-distance-right:0;mso-position-horizontal-relative:page" coordsize="68580,533" o:gfxdata="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">
                 <v:shape id="Graphic 3" o:spid="_x0000_s1027" style="position:absolute;top:434;width:68580;height:13;visibility:visible;mso-wrap-style:square;v-text-anchor:top" coordsize="6858000,1270" o:gfxdata="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" path="m,l6858000,e" filled="f" strokeweight="1.56pt">
                   <v:path arrowok="t"/>
                 </v:shape>
@@ -457,7 +457,7 @@
           </mc:Choice>
           <mc:Fallback>
             <w:pict>
-              <v:shape w14:anchorId="48448739" id="Graphic 6" o:spid="_x0000_s1026" style="position:absolute;margin-left:36pt;margin-top:5.2pt;width:540pt;height:.1pt;z-index:-15728128;visibility:visible;mso-wrap-style:square;mso-wrap-distance-left:0;mso-wrap-distance-top:0;mso-wrap-distance-right:0;mso-wrap-distance-bottom:0;mso-position-horizontal:absolute;mso-position-horizontal-relative:page;mso-position-vertical:absolute;mso-position-vertical-relative:text;v-text-anchor:top" coordsize="6858000,1270" o:gfxdata="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" path="m,l6858000,e" filled="f" strokeweight=".72pt">
+              <v:shape w14:anchorId="48259592" id="Graphic 6" o:spid="_x0000_s1026" style="position:absolute;margin-left:36pt;margin-top:5.2pt;width:540pt;height:.1pt;z-index:-15728128;visibility:visible;mso-wrap-style:square;mso-wrap-distance-left:0;mso-wrap-distance-top:0;mso-wrap-distance-right:0;mso-wrap-distance-bottom:0;mso-position-horizontal:absolute;mso-position-horizontal-relative:page;mso-position-vertical:absolute;mso-position-vertical-relative:text;v-text-anchor:top" coordsize="6858000,1270" o:gfxdata="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" path="m,l6858000,e" filled="f" strokeweight=".72pt">
                 <v:path arrowok="t"/>
                 <w10:wrap type="topAndBottom" anchorx="page"/>
               </v:shape>
@@ -739,7 +739,7 @@
           </mc:Choice>
           <mc:Fallback>
             <w:pict>
-              <v:shape w14:anchorId="112FD59D" id="Graphic 8" o:spid="_x0000_s1026" style="position:absolute;margin-left:36.1pt;margin-top:3.95pt;width:540pt;height:.1pt;z-index:-15727616;visibility:visible;mso-wrap-style:square;mso-wrap-distance-left:0;mso-wrap-distance-top:0;mso-wrap-distance-right:0;mso-wrap-distance-bottom:0;mso-position-horizontal:absolute;mso-position-horizontal-relative:page;mso-position-vertical:absolute;mso-position-vertical-relative:text;v-text-anchor:top" coordsize="6858000,1270" o:gfxdata="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" path="m,l6858000,e" filled="f" strokeweight=".72pt">
+              <v:shape w14:anchorId="3ED97CA2" id="Graphic 8" o:spid="_x0000_s1026" style="position:absolute;margin-left:36.1pt;margin-top:3.95pt;width:540pt;height:.1pt;z-index:-15727616;visibility:visible;mso-wrap-style:square;mso-wrap-distance-left:0;mso-wrap-distance-top:0;mso-wrap-distance-right:0;mso-wrap-distance-bottom:0;mso-position-horizontal:absolute;mso-position-horizontal-relative:page;mso-position-vertical:absolute;mso-position-vertical-relative:text;v-text-anchor:top" coordsize="6858000,1270" o:gfxdata="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" path="m,l6858000,e" filled="f" strokeweight=".72pt">
                 <v:path arrowok="t"/>
                 <w10:wrap type="topAndBottom" anchorx="page"/>
               </v:shape>
@@ -1227,7 +1227,7 @@
           </mc:Choice>
           <mc:Fallback>
             <w:pict>
-              <v:shape w14:anchorId="45654E4D" id="Graphic 9" o:spid="_x0000_s1026" style="position:absolute;margin-left:35.6pt;margin-top:28.75pt;width:540pt;height:.1pt;z-index:15731200;visibility:visible;mso-wrap-style:square;mso-wrap-distance-left:0;mso-wrap-distance-top:0;mso-wrap-distance-right:0;mso-wrap-distance-bottom:0;mso-position-horizontal:absolute;mso-position-horizontal-relative:page;mso-position-vertical:absolute;mso-position-vertical-relative:text;v-text-anchor:top" coordsize="6858000,1270" o:gfxdata="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" path="m,l37833,em,l6858000,e" filled="f" strokeweight=".72pt">
+              <v:shape w14:anchorId="775CC540" id="Graphic 9" o:spid="_x0000_s1026" style="position:absolute;margin-left:35.6pt;margin-top:28.75pt;width:540pt;height:.1pt;z-index:15731200;visibility:visible;mso-wrap-style:square;mso-wrap-distance-left:0;mso-wrap-distance-top:0;mso-wrap-distance-right:0;mso-wrap-distance-bottom:0;mso-position-horizontal:absolute;mso-position-horizontal-relative:page;mso-position-vertical:absolute;mso-position-vertical-relative:text;v-text-anchor:top" coordsize="6858000,1270" o:gfxdata="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" path="m,l37833,em,l6858000,e" filled="f" strokeweight=".72pt">
                 <v:path arrowok="t"/>
                 <w10:wrap anchorx="page"/>
               </v:shape>
@@ -1728,7 +1728,7 @@
           </mc:Choice>
           <mc:Fallback>
             <w:pict>
-              <v:shape w14:anchorId="48B892D5" id="Graphic 12" o:spid="_x0000_s1026" style="position:absolute;margin-left:36.1pt;margin-top:4.05pt;width:540pt;height:.1pt;z-index:-15727104;visibility:visible;mso-wrap-style:square;mso-wrap-distance-left:0;mso-wrap-distance-top:0;mso-wrap-distance-right:0;mso-wrap-distance-bottom:0;mso-position-horizontal:absolute;mso-position-horizontal-relative:page;mso-position-vertical:absolute;mso-position-vertical-relative:text;v-text-anchor:top" coordsize="6858000,1270" o:gfxdata="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" path="m,l6858000,e" filled="f" strokeweight=".72pt">
+              <v:shape w14:anchorId="6A471E0D" id="Graphic 12" o:spid="_x0000_s1026" style="position:absolute;margin-left:36.1pt;margin-top:4.05pt;width:540pt;height:.1pt;z-index:-15727104;visibility:visible;mso-wrap-style:square;mso-wrap-distance-left:0;mso-wrap-distance-top:0;mso-wrap-distance-right:0;mso-wrap-distance-bottom:0;mso-position-horizontal:absolute;mso-position-horizontal-relative:page;mso-position-vertical:absolute;mso-position-vertical-relative:text;v-text-anchor:top" coordsize="6858000,1270" o:gfxdata="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" path="m,l6858000,e" filled="f" strokeweight=".72pt">
                 <v:path arrowok="t"/>
                 <w10:wrap type="topAndBottom" anchorx="page"/>
               </v:shape>
@@ -2098,6 +2098,34 @@
     </w:p>
     <w:p>
       <w:pPr>
+        <w:pStyle w:val="ListParagraph"/>
+        <w:numPr>
+          <w:ilvl w:val="0"/>
+          <w:numId w:val="4"/>
+        </w:numPr>
+        <w:tabs>
+          <w:tab w:val="left" w:pos="8691"/>
+        </w:tabs>
+        <w:spacing w:before="26"/>
+        <w:rPr>
+          <w:b/>
+          <w:spacing w:val="-2"/>
+          <w:szCs w:val="18"/>
+          <w:lang w:val="en-IN"/>
+        </w:rPr>
+      </w:pPr>
+      <w:r>
+        <w:rPr>
+          <w:b/>
+          <w:spacing w:val="-2"/>
+          <w:szCs w:val="18"/>
+          <w:lang w:val="en-IN"/>
+        </w:rPr>
+        <w:t>It is a full stack app.</w:t>
+      </w:r>
+    </w:p>
+    <w:p>
+      <w:pPr>
         <w:tabs>
           <w:tab w:val="left" w:pos="8691"/>
         </w:tabs>
@@ -2540,7 +2568,6 @@
           <w:highlight w:val="yellow"/>
           <w:u w:val="single"/>
         </w:rPr>
-        <w:lastRenderedPageBreak/>
         <w:t>Flutter Sudoku for Androi</w:t>
       </w:r>
       <w:r>
@@ -4165,7 +4192,7 @@
           </mc:Choice>
           <mc:Fallback>
             <w:pict>
-              <v:shape w14:anchorId="2F60F24C" id="Graphic 13" o:spid="_x0000_s1026" style="position:absolute;margin-left:36.1pt;margin-top:15.4pt;width:540pt;height:.1pt;z-index:-15726592;visibility:visible;mso-wrap-style:square;mso-wrap-distance-left:0;mso-wrap-distance-top:0;mso-wrap-distance-right:0;mso-wrap-distance-bottom:0;mso-position-horizontal:absolute;mso-position-horizontal-relative:page;mso-position-vertical:absolute;mso-position-vertical-relative:text;v-text-anchor:top" coordsize="6858000,1270" o:gfxdata="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" path="m,l6858000,e" filled="f" strokeweight=".72pt">
+              <v:shape w14:anchorId="5100B6E8" id="Graphic 13" o:spid="_x0000_s1026" style="position:absolute;margin-left:36.1pt;margin-top:15.4pt;width:540pt;height:.1pt;z-index:-15726592;visibility:visible;mso-wrap-style:square;mso-wrap-distance-left:0;mso-wrap-distance-top:0;mso-wrap-distance-right:0;mso-wrap-distance-bottom:0;mso-position-horizontal:absolute;mso-position-horizontal-relative:page;mso-position-vertical:absolute;mso-position-vertical-relative:text;v-text-anchor:top" coordsize="6858000,1270" o:gfxdata="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" path="m,l6858000,e" filled="f" strokeweight=".72pt">
                 <v:path arrowok="t"/>
                 <w10:wrap type="topAndBottom" anchorx="page"/>
               </v:shape>

</xml_diff>

<commit_message>
Refactored the backend, optimized the extraction pipline and enhanced the scoring formula.
</commit_message>
<xml_diff>
--- a/resumes/Vishv-Resume.docx
+++ b/resumes/Vishv-Resume.docx
@@ -302,7 +302,7 @@
           </mc:Choice>
           <mc:Fallback>
             <w:pict>
-              <v:group w14:anchorId="5C2C3D2E" id="Group 2" o:spid="_x0000_s1026" style="position:absolute;margin-left:36.05pt;margin-top:19.7pt;width:540pt;height:4.2pt;z-index:-15728640;mso-wrap-distance-left:0;mso-wrap-distance-right:0;mso-position-horizontal-relative:page" coordsize="68580,533" o:gfxdata="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">
+              <v:group w14:anchorId="043CF0A2" id="Group 2" o:spid="_x0000_s1026" style="position:absolute;margin-left:36.05pt;margin-top:19.7pt;width:540pt;height:4.2pt;z-index:-15728640;mso-wrap-distance-left:0;mso-wrap-distance-right:0;mso-position-horizontal-relative:page" coordsize="68580,533" o:gfxdata="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">
                 <v:shape id="Graphic 3" o:spid="_x0000_s1027" style="position:absolute;top:434;width:68580;height:13;visibility:visible;mso-wrap-style:square;v-text-anchor:top" coordsize="6858000,1270" o:gfxdata="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" path="m,l6858000,e" filled="f" strokeweight="1.56pt">
                   <v:path arrowok="t"/>
                 </v:shape>
@@ -457,7 +457,7 @@
           </mc:Choice>
           <mc:Fallback>
             <w:pict>
-              <v:shape w14:anchorId="48259592" id="Graphic 6" o:spid="_x0000_s1026" style="position:absolute;margin-left:36pt;margin-top:5.2pt;width:540pt;height:.1pt;z-index:-15728128;visibility:visible;mso-wrap-style:square;mso-wrap-distance-left:0;mso-wrap-distance-top:0;mso-wrap-distance-right:0;mso-wrap-distance-bottom:0;mso-position-horizontal:absolute;mso-position-horizontal-relative:page;mso-position-vertical:absolute;mso-position-vertical-relative:text;v-text-anchor:top" coordsize="6858000,1270" o:gfxdata="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" path="m,l6858000,e" filled="f" strokeweight=".72pt">
+              <v:shape w14:anchorId="5B7AD991" id="Graphic 6" o:spid="_x0000_s1026" style="position:absolute;margin-left:36pt;margin-top:5.2pt;width:540pt;height:.1pt;z-index:-15728128;visibility:visible;mso-wrap-style:square;mso-wrap-distance-left:0;mso-wrap-distance-top:0;mso-wrap-distance-right:0;mso-wrap-distance-bottom:0;mso-position-horizontal:absolute;mso-position-horizontal-relative:page;mso-position-vertical:absolute;mso-position-vertical-relative:text;v-text-anchor:top" coordsize="6858000,1270" o:gfxdata="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" path="m,l6858000,e" filled="f" strokeweight=".72pt">
                 <v:path arrowok="t"/>
                 <w10:wrap type="topAndBottom" anchorx="page"/>
               </v:shape>
@@ -739,7 +739,7 @@
           </mc:Choice>
           <mc:Fallback>
             <w:pict>
-              <v:shape w14:anchorId="3ED97CA2" id="Graphic 8" o:spid="_x0000_s1026" style="position:absolute;margin-left:36.1pt;margin-top:3.95pt;width:540pt;height:.1pt;z-index:-15727616;visibility:visible;mso-wrap-style:square;mso-wrap-distance-left:0;mso-wrap-distance-top:0;mso-wrap-distance-right:0;mso-wrap-distance-bottom:0;mso-position-horizontal:absolute;mso-position-horizontal-relative:page;mso-position-vertical:absolute;mso-position-vertical-relative:text;v-text-anchor:top" coordsize="6858000,1270" o:gfxdata="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" path="m,l6858000,e" filled="f" strokeweight=".72pt">
+              <v:shape w14:anchorId="60A36C7B" id="Graphic 8" o:spid="_x0000_s1026" style="position:absolute;margin-left:36.1pt;margin-top:3.95pt;width:540pt;height:.1pt;z-index:-15727616;visibility:visible;mso-wrap-style:square;mso-wrap-distance-left:0;mso-wrap-distance-top:0;mso-wrap-distance-right:0;mso-wrap-distance-bottom:0;mso-position-horizontal:absolute;mso-position-horizontal-relative:page;mso-position-vertical:absolute;mso-position-vertical-relative:text;v-text-anchor:top" coordsize="6858000,1270" o:gfxdata="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" path="m,l6858000,e" filled="f" strokeweight=".72pt">
                 <v:path arrowok="t"/>
                 <w10:wrap type="topAndBottom" anchorx="page"/>
               </v:shape>
@@ -1227,7 +1227,7 @@
           </mc:Choice>
           <mc:Fallback>
             <w:pict>
-              <v:shape w14:anchorId="775CC540" id="Graphic 9" o:spid="_x0000_s1026" style="position:absolute;margin-left:35.6pt;margin-top:28.75pt;width:540pt;height:.1pt;z-index:15731200;visibility:visible;mso-wrap-style:square;mso-wrap-distance-left:0;mso-wrap-distance-top:0;mso-wrap-distance-right:0;mso-wrap-distance-bottom:0;mso-position-horizontal:absolute;mso-position-horizontal-relative:page;mso-position-vertical:absolute;mso-position-vertical-relative:text;v-text-anchor:top" coordsize="6858000,1270" o:gfxdata="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" path="m,l37833,em,l6858000,e" filled="f" strokeweight=".72pt">
+              <v:shape w14:anchorId="5335C20D" id="Graphic 9" o:spid="_x0000_s1026" style="position:absolute;margin-left:35.6pt;margin-top:28.75pt;width:540pt;height:.1pt;z-index:15731200;visibility:visible;mso-wrap-style:square;mso-wrap-distance-left:0;mso-wrap-distance-top:0;mso-wrap-distance-right:0;mso-wrap-distance-bottom:0;mso-position-horizontal:absolute;mso-position-horizontal-relative:page;mso-position-vertical:absolute;mso-position-vertical-relative:text;v-text-anchor:top" coordsize="6858000,1270" o:gfxdata="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" path="m,l37833,em,l6858000,e" filled="f" strokeweight=".72pt">
                 <v:path arrowok="t"/>
                 <w10:wrap anchorx="page"/>
               </v:shape>
@@ -1728,7 +1728,7 @@
           </mc:Choice>
           <mc:Fallback>
             <w:pict>
-              <v:shape w14:anchorId="6A471E0D" id="Graphic 12" o:spid="_x0000_s1026" style="position:absolute;margin-left:36.1pt;margin-top:4.05pt;width:540pt;height:.1pt;z-index:-15727104;visibility:visible;mso-wrap-style:square;mso-wrap-distance-left:0;mso-wrap-distance-top:0;mso-wrap-distance-right:0;mso-wrap-distance-bottom:0;mso-position-horizontal:absolute;mso-position-horizontal-relative:page;mso-position-vertical:absolute;mso-position-vertical-relative:text;v-text-anchor:top" coordsize="6858000,1270" o:gfxdata="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" path="m,l6858000,e" filled="f" strokeweight=".72pt">
+              <v:shape w14:anchorId="243AF1D1" id="Graphic 12" o:spid="_x0000_s1026" style="position:absolute;margin-left:36.1pt;margin-top:4.05pt;width:540pt;height:.1pt;z-index:-15727104;visibility:visible;mso-wrap-style:square;mso-wrap-distance-left:0;mso-wrap-distance-top:0;mso-wrap-distance-right:0;mso-wrap-distance-bottom:0;mso-position-horizontal:absolute;mso-position-horizontal-relative:page;mso-position-vertical:absolute;mso-position-vertical-relative:text;v-text-anchor:top" coordsize="6858000,1270" o:gfxdata="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" path="m,l6858000,e" filled="f" strokeweight=".72pt">
                 <v:path arrowok="t"/>
                 <w10:wrap type="topAndBottom" anchorx="page"/>
               </v:shape>
@@ -2039,7 +2039,43 @@
           <w:szCs w:val="18"/>
           <w:lang w:val="en-IN"/>
         </w:rPr>
-        <w:t>JS Frameworks</w:t>
+        <w:t>J</w:t>
+      </w:r>
+      <w:r>
+        <w:rPr>
+          <w:b/>
+          <w:spacing w:val="-2"/>
+          <w:szCs w:val="18"/>
+          <w:lang w:val="en-IN"/>
+        </w:rPr>
+        <w:t>ava</w:t>
+      </w:r>
+      <w:r>
+        <w:rPr>
+          <w:b/>
+          <w:spacing w:val="-2"/>
+          <w:szCs w:val="18"/>
+          <w:lang w:val="en-IN"/>
+        </w:rPr>
+        <w:t>S</w:t>
+      </w:r>
+      <w:r>
+        <w:rPr>
+          <w:b/>
+          <w:spacing w:val="-2"/>
+          <w:szCs w:val="18"/>
+          <w:lang w:val="en-IN"/>
+        </w:rPr>
+        <w:t>cript</w:t>
+      </w:r>
+      <w:r>
+        <w:rPr>
+          <w:b/>
+          <w:spacing w:val="-2"/>
+          <w:szCs w:val="18"/>
+          <w:lang w:val="en-IN"/>
+        </w:rPr>
+        <w:t xml:space="preserve"> Frameworks</w:t>
       </w:r>
       <w:r>
         <w:rPr>
@@ -4115,9 +4151,37 @@
     <w:p>
       <w:pPr>
         <w:pStyle w:val="BodyText"/>
+        <w:spacing w:before="8"/>
+      </w:pPr>
+    </w:p>
+    <w:p>
+      <w:pPr>
+        <w:pStyle w:val="BodyText"/>
+        <w:spacing w:before="8"/>
+        <w:rPr>
+          <w:b/>
+          <w:bCs/>
+          <w:sz w:val="32"/>
+          <w:szCs w:val="32"/>
+        </w:rPr>
+      </w:pPr>
+      <w:r>
+        <w:rPr>
+          <w:b/>
+          <w:bCs/>
+          <w:sz w:val="32"/>
+          <w:szCs w:val="32"/>
+        </w:rPr>
+        <w:t>Certificates</w:t>
+      </w:r>
+    </w:p>
+    <w:p>
+      <w:pPr>
+        <w:pStyle w:val="BodyText"/>
         <w:spacing w:before="39"/>
         <w:rPr>
-          <w:sz w:val="20"/>
+          <w:b/>
+          <w:sz w:val="4"/>
         </w:rPr>
       </w:pPr>
       <w:r>
@@ -4192,7 +4256,7 @@
           </mc:Choice>
           <mc:Fallback>
             <w:pict>
-              <v:shape w14:anchorId="5100B6E8" id="Graphic 13" o:spid="_x0000_s1026" style="position:absolute;margin-left:36.1pt;margin-top:15.4pt;width:540pt;height:.1pt;z-index:-15726592;visibility:visible;mso-wrap-style:square;mso-wrap-distance-left:0;mso-wrap-distance-top:0;mso-wrap-distance-right:0;mso-wrap-distance-bottom:0;mso-position-horizontal:absolute;mso-position-horizontal-relative:page;mso-position-vertical:absolute;mso-position-vertical-relative:text;v-text-anchor:top" coordsize="6858000,1270" o:gfxdata="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" path="m,l6858000,e" filled="f" strokeweight=".72pt">
+              <v:shape w14:anchorId="671E71CA" id="Graphic 13" o:spid="_x0000_s1026" style="position:absolute;margin-left:36.1pt;margin-top:15.4pt;width:540pt;height:.1pt;z-index:-15726592;visibility:visible;mso-wrap-style:square;mso-wrap-distance-left:0;mso-wrap-distance-top:0;mso-wrap-distance-right:0;mso-wrap-distance-bottom:0;mso-position-horizontal:absolute;mso-position-horizontal-relative:page;mso-position-vertical:absolute;mso-position-vertical-relative:text;v-text-anchor:top" coordsize="6858000,1270" o:gfxdata="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" path="m,l6858000,e" filled="f" strokeweight=".72pt">
                 <v:path arrowok="t"/>
                 <w10:wrap type="topAndBottom" anchorx="page"/>
               </v:shape>
@@ -4200,23 +4264,11 @@
           </mc:Fallback>
         </mc:AlternateContent>
       </w:r>
-    </w:p>
-    <w:p>
-      <w:pPr>
-        <w:spacing w:before="1"/>
-        <w:ind w:left="360"/>
-        <w:rPr>
-          <w:b/>
-          <w:sz w:val="4"/>
-        </w:rPr>
-      </w:pPr>
-      <w:r>
-        <w:rPr>
-          <w:b/>
-          <w:spacing w:val="-10"/>
-          <w:sz w:val="4"/>
-        </w:rPr>
-        <w:t>_</w:t>
+      <w:r>
+        <w:rPr>
+          <w:sz w:val="20"/>
+        </w:rPr>
+        <w:t xml:space="preserve"> AWS Cloud computing certificate, Coursera Full stack development, Udemy python developer.</w:t>
       </w:r>
     </w:p>
     <w:p>

</xml_diff>